<commit_message>
Manuscript: fix typos, plural author wording, bdhs version and AI disclosure; update cover letter for co-authors
Co-Authored-By: Claude Opus 5.5 <noreply@anthropic.com>
</commit_message>
<xml_diff>
--- a/paper/submission/Cover_letter.docx
+++ b/paper/submission/Cover_letter.docx
@@ -10,19 +10,19 @@
         <w:t xml:space="preserve">Arman Hossen</w:t>
       </w:r>
       <w:r>
-        <w:t xml:space="preserve"> </w:t>
+        <w:br/>
       </w:r>
       <w:r>
         <w:t xml:space="preserve">Department of Statistics, Miami University</w:t>
       </w:r>
       <w:r>
-        <w:t xml:space="preserve"> </w:t>
+        <w:br/>
       </w:r>
       <w:r>
         <w:t xml:space="preserve">Oxford, Ohio, USA</w:t>
       </w:r>
       <w:r>
-        <w:t xml:space="preserve"> </w:t>
+        <w:br/>
       </w:r>
       <w:r>
         <w:t xml:space="preserve">hossena@miamioh.edu | ORCID 0009-0003-4346-1026</w:t>
@@ -36,7 +36,7 @@
         <w:t xml:space="preserve">The Editor</w:t>
       </w:r>
       <w:r>
-        <w:t xml:space="preserve"> </w:t>
+        <w:br/>
       </w:r>
       <w:r>
         <w:rPr>
@@ -59,7 +59,7 @@
         <w:pStyle w:val="BodyText"/>
       </w:pPr>
       <w:r>
-        <w:t xml:space="preserve">I am pleased to submit the manuscript</w:t>
+        <w:t xml:space="preserve">On behalf of my co-authors, I am pleased to submit the manuscript</w:t>
       </w:r>
       <w:r>
         <w:t xml:space="preserve"> </w:t>
@@ -69,47 +69,13 @@
           <w:b/>
           <w:bCs/>
         </w:rPr>
-        <w:t xml:space="preserve">“Reproducing three decades of the</w:t>
-      </w:r>
-      <w:r>
-        <w:rPr>
-          <w:b/>
-          <w:bCs/>
-        </w:rPr>
+        <w:t xml:space="preserve">“Reproducing official estimates from the Bangladesh Demographic and Health Survey, 1993-2022: Application of bdhs R package”</w:t>
+      </w:r>
+      <w:r>
         <w:t xml:space="preserve"> </w:t>
       </w:r>
       <w:r>
-        <w:rPr>
-          <w:b/>
-          <w:bCs/>
-        </w:rPr>
-        <w:t xml:space="preserve">Bangladesh Demographic and Health Survey: validation, analytic pitfalls, data</w:t>
-      </w:r>
-      <w:r>
-        <w:rPr>
-          <w:b/>
-          <w:bCs/>
-        </w:rPr>
-        <w:t xml:space="preserve"> </w:t>
-      </w:r>
-      <w:r>
-        <w:rPr>
-          <w:b/>
-          <w:bCs/>
-        </w:rPr>
-        <w:t xml:space="preserve">quality and calibrated synthetic data with the bdhs R package”</w:t>
-      </w:r>
-      <w:r>
-        <w:t xml:space="preserve"> </w:t>
-      </w:r>
-      <w:r>
-        <w:t xml:space="preserve">for</w:t>
-      </w:r>
-      <w:r>
-        <w:t xml:space="preserve"> </w:t>
-      </w:r>
-      <w:r>
-        <w:t xml:space="preserve">consideration as a research article in</w:t>
+        <w:t xml:space="preserve">by Arman Hossen, Ashiqur Rahman Rony, Abida Sultana Asha and Kazi Sabbir Ahmad Nahin, for consideration as a research article in</w:t>
       </w:r>
       <w:r>
         <w:t xml:space="preserve"> </w:t>
@@ -130,25 +96,7 @@
         <w:pStyle w:val="BodyText"/>
       </w:pPr>
       <w:r>
-        <w:t xml:space="preserve">Demographic and Health Surveys are among the most widely analysed data</w:t>
-      </w:r>
-      <w:r>
-        <w:t xml:space="preserve"> </w:t>
-      </w:r>
-      <w:r>
-        <w:t xml:space="preserve">sources in global health, yet analyses of the respondent-level files are</w:t>
-      </w:r>
-      <w:r>
-        <w:t xml:space="preserve"> </w:t>
-      </w:r>
-      <w:r>
-        <w:t xml:space="preserve">rarely checked against the official estimates. For Bangladesh, several</w:t>
-      </w:r>
-      <w:r>
-        <w:t xml:space="preserve"> </w:t>
-      </w:r>
-      <w:r>
-        <w:t xml:space="preserve">features of the survey are easy to get wrong:</w:t>
+        <w:t xml:space="preserve">Demographic and Health Surveys are among the most widely analysed data sources in global health, yet analyses of the respondent-level files are rarely checked against the official estimates. For Bangladesh, several features of the survey are easy to get wrong:</w:t>
       </w:r>
     </w:p>
     <w:p>
@@ -200,19 +148,7 @@
         <w:pStyle w:val="BodyText"/>
       </w:pPr>
       <w:r>
-        <w:t xml:space="preserve">In this paper I present bdhs, an open-source R package covering all nine</w:t>
-      </w:r>
-      <w:r>
-        <w:t xml:space="preserve"> </w:t>
-      </w:r>
-      <w:r>
-        <w:t xml:space="preserve">Bangladesh DHS rounds (1993-94 to 2022), and use it to make four</w:t>
-      </w:r>
-      <w:r>
-        <w:t xml:space="preserve"> </w:t>
-      </w:r>
-      <w:r>
-        <w:t xml:space="preserve">contributions that I believe will interest your readers:</w:t>
+        <w:t xml:space="preserve">In this paper we present bdhs, an open-source R package covering all nine Bangladesh DHS rounds (1993-94 to 2022), and use it to make four contributions that we believe will interest your readers:</w:t>
       </w:r>
     </w:p>
     <w:p>
@@ -234,19 +170,7 @@
         <w:t xml:space="preserve"> </w:t>
       </w:r>
       <w:r>
-        <w:t xml:space="preserve">353 of 355 national estimates computed from the recode</w:t>
-      </w:r>
-      <w:r>
-        <w:t xml:space="preserve"> </w:t>
-      </w:r>
-      <w:r>
-        <w:t xml:space="preserve">files reproduce the official values, with a median absolute difference of</w:t>
-      </w:r>
-      <w:r>
-        <w:t xml:space="preserve"> </w:t>
-      </w:r>
-      <w:r>
-        <w:t xml:space="preserve">0.03 percentage points.</w:t>
+        <w:t xml:space="preserve">353 of 355 national estimates computed from the recode files reproduce the official values, with a median absolute difference of 0.03 percentage points.</w:t>
       </w:r>
     </w:p>
     <w:p>
@@ -268,31 +192,7 @@
         <w:t xml:space="preserve"> </w:t>
       </w:r>
       <w:r>
-        <w:t xml:space="preserve">Treating the ever-married sample as all women</w:t>
-      </w:r>
-      <w:r>
-        <w:t xml:space="preserve"> </w:t>
-      </w:r>
-      <w:r>
-        <w:t xml:space="preserve">overstates child marriage by about ten percentage points, ignoring the</w:t>
-      </w:r>
-      <w:r>
-        <w:t xml:space="preserve"> </w:t>
-      </w:r>
-      <w:r>
-        <w:t xml:space="preserve">2022 short questionnaire understates unmet need for family planning by a</w:t>
-      </w:r>
-      <w:r>
-        <w:t xml:space="preserve"> </w:t>
-      </w:r>
-      <w:r>
-        <w:t xml:space="preserve">third, and ignoring the sample design makes standard errors up to 1.8</w:t>
-      </w:r>
-      <w:r>
-        <w:t xml:space="preserve"> </w:t>
-      </w:r>
-      <w:r>
-        <w:t xml:space="preserve">times too small.</w:t>
+        <w:t xml:space="preserve">Treating the ever-married sample as all women overstates child marriage by about ten percentage points, ignoring the 2022 short questionnaire understates unmet need for family planning by a third, and ignoring the sample design makes standard errors up to 1.8 times too small.</w:t>
       </w:r>
     </w:p>
     <w:p>
@@ -314,13 +214,7 @@
         <w:t xml:space="preserve"> </w:t>
       </w:r>
       <w:r>
-        <w:t xml:space="preserve">A data-quality assessment across 30 years of surveys,</w:t>
-      </w:r>
-      <w:r>
-        <w:t xml:space="preserve"> </w:t>
-      </w:r>
-      <w:r>
-        <w:t xml:space="preserve">covering age and date reporting and anthropometric measurement.</w:t>
+        <w:t xml:space="preserve">A data-quality assessment across 30 years of surveys, covering age and date reporting and anthropometric measurement.</w:t>
       </w:r>
     </w:p>
     <w:p>
@@ -342,25 +236,7 @@
         <w:t xml:space="preserve"> </w:t>
       </w:r>
       <w:r>
-        <w:t xml:space="preserve">A new way of generating synthetic data from</w:t>
-      </w:r>
-      <w:r>
-        <w:t xml:space="preserve"> </w:t>
-      </w:r>
-      <w:r>
-        <w:t xml:space="preserve">published aggregates only, reproducing 1,278 official national and</w:t>
-      </w:r>
-      <w:r>
-        <w:t xml:space="preserve"> </w:t>
-      </w:r>
-      <w:r>
-        <w:t xml:space="preserve">subnational estimates to within 0.21 percentage points. Analyses can then</w:t>
-      </w:r>
-      <w:r>
-        <w:t xml:space="preserve"> </w:t>
-      </w:r>
-      <w:r>
-        <w:t xml:space="preserve">be taught, tested and shared without access to restricted microdata.</w:t>
+        <w:t xml:space="preserve">A new way of generating synthetic data from published aggregates only, reproducing 1,278 official national and subnational estimates to within 0.21 percentage points. Analyses can then be taught, tested and shared without access to restricted microdata.</w:t>
       </w:r>
     </w:p>
     <w:p>
@@ -368,13 +244,7 @@
         <w:pStyle w:val="FirstParagraph"/>
       </w:pPr>
       <w:r>
-        <w:t xml:space="preserve">A case study of caesarean delivery between 2004 and 2022 shows how trends,</w:t>
-      </w:r>
-      <w:r>
-        <w:t xml:space="preserve"> </w:t>
-      </w:r>
-      <w:r>
-        <w:t xml:space="preserve">inequality and decomposition can be analysed with correct survey methods.</w:t>
+        <w:t xml:space="preserve">A case study of caesarean delivery between 2004 and 2022 shows how trends, inequality and decomposition can be analysed with correct survey methods.</w:t>
       </w:r>
     </w:p>
     <w:p>
@@ -382,25 +252,7 @@
         <w:pStyle w:val="BodyText"/>
       </w:pPr>
       <w:r>
-        <w:t xml:space="preserve">The work fits the journal’s focus on methods for health research,</w:t>
-      </w:r>
-      <w:r>
-        <w:t xml:space="preserve"> </w:t>
-      </w:r>
-      <w:r>
-        <w:t xml:space="preserve">reproducibility and the analysis of complex survey data. The software,</w:t>
-      </w:r>
-      <w:r>
-        <w:t xml:space="preserve"> </w:t>
-      </w:r>
-      <w:r>
-        <w:t xml:space="preserve">analysis scripts and all aggregate results are openly available on GitHub;</w:t>
-      </w:r>
-      <w:r>
-        <w:t xml:space="preserve"> </w:t>
-      </w:r>
-      <w:r>
-        <w:t xml:space="preserve">the microdata are available to registered users from The DHS Program.</w:t>
+        <w:t xml:space="preserve">The work fits the journal’s focus on methods for health research, reproducibility and the analysis of complex survey data. The software, analysis scripts and all aggregate results are openly available on GitHub; the microdata are available to registered users from The DHS Program.</w:t>
       </w:r>
     </w:p>
     <w:p>
@@ -408,7 +260,7 @@
         <w:pStyle w:val="BodyText"/>
       </w:pPr>
       <w:r>
-        <w:t xml:space="preserve">I confirm that:</w:t>
+        <w:t xml:space="preserve">We confirm that:</w:t>
       </w:r>
     </w:p>
     <w:p>
@@ -420,13 +272,7 @@
         </w:numPr>
       </w:pPr>
       <w:r>
-        <w:t xml:space="preserve">the manuscript is original, has not been published, and is not under</w:t>
-      </w:r>
-      <w:r>
-        <w:t xml:space="preserve"> </w:t>
-      </w:r>
-      <w:r>
-        <w:t xml:space="preserve">consideration elsewhere;</w:t>
+        <w:t xml:space="preserve">the manuscript is original, has not been published, and is not under consideration elsewhere;</w:t>
       </w:r>
     </w:p>
     <w:p>
@@ -438,7 +284,20 @@
         </w:numPr>
       </w:pPr>
       <w:r>
-        <w:t xml:space="preserve">there are no competing interests and the work received no specific funding;</w:t>
+        <w:t xml:space="preserve">a short paper describing the software alone is being prepared for the</w:t>
+      </w:r>
+      <w:r>
+        <w:t xml:space="preserve"> </w:t>
+      </w:r>
+      <w:r>
+        <w:rPr>
+          <w:i/>
+          <w:iCs/>
+        </w:rPr>
+        <w:t xml:space="preserve">Journal of Open Source Software</w:t>
+      </w:r>
+      <w:r>
+        <w:t xml:space="preserve">; it does not report the analyses in this manuscript;</w:t>
       </w:r>
     </w:p>
     <w:p>
@@ -450,19 +309,31 @@
         </w:numPr>
       </w:pPr>
       <w:r>
-        <w:t xml:space="preserve">the use of an AI assistant for software development and drafting is</w:t>
-      </w:r>
-      <w:r>
-        <w:t xml:space="preserve"> </w:t>
-      </w:r>
-      <w:r>
-        <w:t xml:space="preserve">disclosed in the Acknowledgements, and I have verified all code, analyses</w:t>
-      </w:r>
-      <w:r>
-        <w:t xml:space="preserve"> </w:t>
-      </w:r>
-      <w:r>
-        <w:t xml:space="preserve">and text.</w:t>
+        <w:t xml:space="preserve">all authors have read and approved the manuscript;</w:t>
+      </w:r>
+    </w:p>
+    <w:p>
+      <w:pPr>
+        <w:pStyle w:val="Compact"/>
+        <w:numPr>
+          <w:ilvl w:val="0"/>
+          <w:numId w:val="1003"/>
+        </w:numPr>
+      </w:pPr>
+      <w:r>
+        <w:t xml:space="preserve">there are no competing interests and the work received no specific funding;</w:t>
+      </w:r>
+    </w:p>
+    <w:p>
+      <w:pPr>
+        <w:pStyle w:val="Compact"/>
+        <w:numPr>
+          <w:ilvl w:val="0"/>
+          <w:numId w:val="1003"/>
+        </w:numPr>
+      </w:pPr>
+      <w:r>
+        <w:t xml:space="preserve">the use of an AI assistant for software development and drafting is disclosed in the Acknowledgements, and the authors have verified all code, analyses and text.</w:t>
       </w:r>
     </w:p>
     <w:p>
@@ -487,6 +358,12 @@
       </w:pPr>
       <w:r>
         <w:t xml:space="preserve">Arman Hossen</w:t>
+      </w:r>
+      <w:r>
+        <w:br/>
+      </w:r>
+      <w:r>
+        <w:t xml:space="preserve">Corresponding author, on behalf of all authors</w:t>
       </w:r>
     </w:p>
     <w:sectPr>

</xml_diff>